<commit_message>
Generalize resume content and refactor build script to data-driven content
Broaden summary/skills from a narrow trust-and-safety pitch to a general
senior/staff engineering profile, drop the awards bullet, and restructure
build_resume.js around a single DATA object instead of inline paragraph
calls. Document the gws-based docx-to-PDF export step in CLAUDE.md, since
that (not a local Word/Pages export) is what actually produces the live PDF.

Co-Authored-By: Claude Sonnet 5 <noreply@anthropic.com>
</commit_message>
<xml_diff>
--- a/files/resume/Aayush_Ahuja_Resume.docx
+++ b/files/resume/Aayush_Ahuja_Resume.docx
@@ -58,7 +58,7 @@
           <w:sz w:val="21"/>
           <w:szCs w:val="21"/>
         </w:rPr>
-        <w:t xml:space="preserve">Staff software engineer (IC6) specializing in integrity and adversarial systems — 10+ years studying how adversaries operate and building the detection and enforcement systems to stop them at scale. Currently transforming integrity systems using autonomous agent systems for abuse discovery, investigation, and mitigation (scams, fraud, child safety, gambling, drugs, adult content etc) spanning multiple teams at Meta.</w:t>
+        <w:t xml:space="preserve">Staff software engineer (IC6) with 10+ years building large-scale detection, ML, and agentic systems. Deep experience across distributed data infrastructure, ML/LLM infrastructure, and safety-critical systems, with a strong track record of technical leadership across large, cross-functional orgs. Currently leading the adoption of autonomous multi-agent systems for large-scale system monitoring, investigation, and remediation across multiple teams at Meta.</w:t>
       </w:r>
     </w:p>
     <w:p>
@@ -173,7 +173,7 @@
           <w:sz w:val="19"/>
           <w:szCs w:val="19"/>
         </w:rPr>
-        <w:t xml:space="preserve">Specialization in adversarial analysis and integrity systems design; technical scope spans 30+ engineers</w:t>
+        <w:t xml:space="preserve">Technical direction across large-scale systems, ML infrastructure, and autonomous agent platforms; technical scope spans 30+ engineers</w:t>
       </w:r>
     </w:p>
     <w:p>
@@ -190,7 +190,7 @@
           <w:sz w:val="21"/>
           <w:szCs w:val="21"/>
         </w:rPr>
-        <w:t xml:space="preserve">Leading design and delivery of cross-integrity autonomous multi-agent self-learning system for content red-teaming, adopted across 13+ teams: agents search and discover integrity violations on FB/IG/Ads, fan out across the adversarial network, perform root-cause analysis, and propose long-term fixes — used across a wide range of problems like scams, adult content, child safety, gambling, drugs, and other abuse domains; also used to respond to the majority of high-profile escalations from governments and press. Implemented multiple novel recursive self-improvement techniques and memory to make the agent more effective.</w:t>
+        <w:t xml:space="preserve">Leading design and delivery of a cross-org autonomous multi-agent self-learning system for large-scale issue discovery, adopted across 13+ teams: agents search and discover problems in production systems, fan out across related surfaces, perform root-cause analysis, and propose long-term fixes; also used to respond to the majority of high-profile escalations from governments and press. Implemented multiple novel recursive self-improvement techniques and memory to make the agent more effective.</w:t>
       </w:r>
     </w:p>
     <w:p>
@@ -276,23 +276,6 @@
           <w:szCs w:val="21"/>
         </w:rPr>
         <w:t xml:space="preserve">Expanded integrity engineering frameworks and skills — adopted by 1,000+ engineers; led cross-org sessions on AI-assisted engineering productivity for 200+ engineers, and trained 150+ engineers to be AI-native as part of an org-wide AI4Productivity initiative</w:t>
-      </w:r>
-    </w:p>
-    <w:p>
-      <w:pPr>
-        <w:pStyle w:val="ListParagraph"/>
-        <w:numPr>
-          <w:ilvl w:val="0"/>
-          <w:numId w:val="2"/>
-        </w:numPr>
-        <w:spacing w:after="80"/>
-      </w:pPr>
-      <w:r>
-        <w:rPr>
-          <w:sz w:val="21"/>
-          <w:szCs w:val="21"/>
-        </w:rPr>
-        <w:t xml:space="preserve">Recipient, Meta AI Award (Integrity) and Integrity Builder Award; top-rated performer for three consecutive annual review cycles (2024–2026)</w:t>
       </w:r>
     </w:p>
     <w:tbl>
@@ -659,7 +642,7 @@
           <w:sz w:val="21"/>
           <w:szCs w:val="21"/>
         </w:rPr>
-        <w:t xml:space="preserve">Python  ·  LLM / agentic system design  ·  Trust &amp; safety and anti-fraud / anti-abuse detection  ·  Adversarial red-teaming  ·  ML infrastructure &amp; evaluation  ·  Prompt-injection &amp; AI safety defenses  ·  Cross-org technical leadership</w:t>
+        <w:t xml:space="preserve">Python  ·  LLM / agentic system design  ·  Distributed systems &amp; data infrastructure  ·  ML infrastructure &amp; evaluation  ·  Large-scale detection systems  ·  Cross-org technical leadership  ·  AI safety &amp; red-teaming</w:t>
       </w:r>
     </w:p>
     <w:sectPr>

</xml_diff>